<commit_message>
Update dashboard and project documentation
Co-Authored-By: Claude Sonnet 4.6 <noreply@anthropic.com>
</commit_message>
<xml_diff>
--- a/Player-Pulse-A-Lifecycle-Segmentation-Framework-for-Live-Service-Products.docx
+++ b/Player-Pulse-A-Lifecycle-Segmentation-Framework-for-Live-Service-Products.docx
@@ -12,12 +12,12 @@
           <wp:inline distB="114300" distT="114300" distL="114300" distR="114300">
             <wp:extent cx="5943600" cy="2286000"/>
             <wp:effectExtent b="0" l="0" r="0" t="0"/>
-            <wp:docPr id="9" name="image10.png"/>
+            <wp:docPr id="4" name="image5.png"/>
             <a:graphic>
               <a:graphicData uri="http://schemas.openxmlformats.org/drawingml/2006/picture">
                 <pic:pic>
                   <pic:nvPicPr>
-                    <pic:cNvPr id="0" name="image10.png"/>
+                    <pic:cNvPr id="0" name="image5.png"/>
                     <pic:cNvPicPr preferRelativeResize="0"/>
                   </pic:nvPicPr>
                   <pic:blipFill>
@@ -97,7 +97,20 @@
           <w:rFonts w:ascii="Calibri" w:cs="Calibri" w:eastAsia="Calibri" w:hAnsi="Calibri"/>
           <w:rtl w:val="0"/>
         </w:rPr>
-        <w:t xml:space="preserve">The transaction dataset contains synthetic data for 5,000 users across 2025, designed to reflect realistic spending distribution patterns — from low-frequency casual buyers to high-LTV power users — mirroring the spending skew typically seen in free-to-play game economies</w:t>
+        <w:t xml:space="preserve">The transaction dataset contains synthetic data for 100,000 users across 2025, designed to reflect realistic spending distribution patterns. These players created over 35 million in revenue over more than 500,000 transactions.</w:t>
+      </w:r>
+    </w:p>
+    <w:p>
+      <w:pPr>
+        <w:spacing w:after="120" w:lineRule="auto"/>
+        <w:rPr>
+          <w:rFonts w:ascii="Calibri" w:cs="Calibri" w:eastAsia="Calibri" w:hAnsi="Calibri"/>
+        </w:rPr>
+      </w:pPr>
+      <w:r>
+        <w:rPr>
+          <w:rtl w:val="0"/>
+        </w:rPr>
       </w:r>
     </w:p>
     <w:p>
@@ -133,12 +146,12 @@
           <wp:inline distB="114300" distT="114300" distL="114300" distR="114300">
             <wp:extent cx="6415088" cy="5552453"/>
             <wp:effectExtent b="0" l="0" r="0" t="0"/>
-            <wp:docPr id="1" name="image8.png"/>
+            <wp:docPr id="6" name="image2.png"/>
             <a:graphic>
               <a:graphicData uri="http://schemas.openxmlformats.org/drawingml/2006/picture">
                 <pic:pic>
                   <pic:nvPicPr>
-                    <pic:cNvPr id="0" name="image8.png"/>
+                    <pic:cNvPr id="0" name="image2.png"/>
                     <pic:cNvPicPr preferRelativeResize="0"/>
                   </pic:nvPicPr>
                   <pic:blipFill>
@@ -215,7 +228,7 @@
       <w:pPr>
         <w:numPr>
           <w:ilvl w:val="0"/>
-          <w:numId w:val="1"/>
+          <w:numId w:val="2"/>
         </w:numPr>
         <w:ind w:left="720" w:hanging="360"/>
         <w:rPr>
@@ -227,78 +240,6 @@
           <w:rtl w:val="0"/>
         </w:rPr>
         <w:t xml:space="preserve">the transaction variables are correlated with retention and account age</w:t>
-      </w:r>
-    </w:p>
-    <w:p>
-      <w:pPr>
-        <w:numPr>
-          <w:ilvl w:val="0"/>
-          <w:numId w:val="1"/>
-        </w:numPr>
-        <w:ind w:left="720" w:hanging="360"/>
-        <w:rPr>
-          <w:u w:val="none"/>
-        </w:rPr>
-      </w:pPr>
-      <w:r>
-        <w:rPr>
-          <w:rtl w:val="0"/>
-        </w:rPr>
-        <w:t xml:space="preserve">Agent diversity is correlated with seasons active</w:t>
-      </w:r>
-    </w:p>
-    <w:p>
-      <w:pPr>
-        <w:numPr>
-          <w:ilvl w:val="0"/>
-          <w:numId w:val="1"/>
-        </w:numPr>
-        <w:ind w:left="720" w:hanging="360"/>
-        <w:rPr>
-          <w:u w:val="none"/>
-        </w:rPr>
-      </w:pPr>
-      <w:r>
-        <w:rPr>
-          <w:rtl w:val="0"/>
-        </w:rPr>
-        <w:t xml:space="preserve">Esports watcher is correlated with seasons active</w:t>
-      </w:r>
-      <w:r>
-        <w:rPr>
-          <w:rtl w:val="0"/>
-        </w:rPr>
-        <w:t xml:space="preserve">,average sessions per week, age of account</w:t>
-      </w:r>
-    </w:p>
-    <w:p>
-      <w:pPr>
-        <w:numPr>
-          <w:ilvl w:val="0"/>
-          <w:numId w:val="1"/>
-        </w:numPr>
-        <w:ind w:left="720" w:hanging="360"/>
-        <w:rPr>
-          <w:u w:val="none"/>
-        </w:rPr>
-      </w:pPr>
-      <w:r>
-        <w:rPr>
-          <w:rtl w:val="0"/>
-        </w:rPr>
-        <w:t xml:space="preserve">Cross platform correlated to season active and account age</w:t>
-      </w:r>
-    </w:p>
-    <w:p>
-      <w:pPr>
-        <w:ind w:left="0" w:firstLine="0"/>
-        <w:rPr/>
-      </w:pPr>
-      <w:r>
-        <w:rPr>
-          <w:rtl w:val="0"/>
-        </w:rPr>
-        <w:t xml:space="preserve">Negative</w:t>
       </w:r>
     </w:p>
     <w:p>
@@ -316,7 +257,7 @@
         <w:rPr>
           <w:rtl w:val="0"/>
         </w:rPr>
-        <w:t xml:space="preserve">Cohort and seasons active </w:t>
+        <w:t xml:space="preserve">Agent diversity is correlated with seasons active</w:t>
       </w:r>
     </w:p>
     <w:p>
@@ -334,7 +275,13 @@
         <w:rPr>
           <w:rtl w:val="0"/>
         </w:rPr>
-        <w:t xml:space="preserve">Cohort and account age</w:t>
+        <w:t xml:space="preserve">Esports watcher is correlated with seasons active</w:t>
+      </w:r>
+      <w:r>
+        <w:rPr>
+          <w:rtl w:val="0"/>
+        </w:rPr>
+        <w:t xml:space="preserve">,average sessions per week, age of account</w:t>
       </w:r>
     </w:p>
     <w:p>
@@ -352,6 +299,72 @@
         <w:rPr>
           <w:rtl w:val="0"/>
         </w:rPr>
+        <w:t xml:space="preserve">Cross platform correlated to season active and account age</w:t>
+      </w:r>
+    </w:p>
+    <w:p>
+      <w:pPr>
+        <w:ind w:left="0" w:firstLine="0"/>
+        <w:rPr/>
+      </w:pPr>
+      <w:r>
+        <w:rPr>
+          <w:rtl w:val="0"/>
+        </w:rPr>
+        <w:t xml:space="preserve">Negative</w:t>
+      </w:r>
+    </w:p>
+    <w:p>
+      <w:pPr>
+        <w:numPr>
+          <w:ilvl w:val="0"/>
+          <w:numId w:val="5"/>
+        </w:numPr>
+        <w:ind w:left="720" w:hanging="360"/>
+        <w:rPr>
+          <w:u w:val="none"/>
+        </w:rPr>
+      </w:pPr>
+      <w:r>
+        <w:rPr>
+          <w:rtl w:val="0"/>
+        </w:rPr>
+        <w:t xml:space="preserve">Cohort and seasons active </w:t>
+      </w:r>
+    </w:p>
+    <w:p>
+      <w:pPr>
+        <w:numPr>
+          <w:ilvl w:val="0"/>
+          <w:numId w:val="5"/>
+        </w:numPr>
+        <w:ind w:left="720" w:hanging="360"/>
+        <w:rPr>
+          <w:u w:val="none"/>
+        </w:rPr>
+      </w:pPr>
+      <w:r>
+        <w:rPr>
+          <w:rtl w:val="0"/>
+        </w:rPr>
+        <w:t xml:space="preserve">Cohort and account age</w:t>
+      </w:r>
+    </w:p>
+    <w:p>
+      <w:pPr>
+        <w:numPr>
+          <w:ilvl w:val="0"/>
+          <w:numId w:val="5"/>
+        </w:numPr>
+        <w:ind w:left="720" w:hanging="360"/>
+        <w:rPr>
+          <w:u w:val="none"/>
+        </w:rPr>
+      </w:pPr>
+      <w:r>
+        <w:rPr>
+          <w:rtl w:val="0"/>
+        </w:rPr>
         <w:t xml:space="preserve">Transaction and recency</w:t>
       </w:r>
     </w:p>
@@ -683,12 +696,12 @@
           <wp:inline distB="114300" distT="114300" distL="114300" distR="114300">
             <wp:extent cx="4876800" cy="5143500"/>
             <wp:effectExtent b="0" l="0" r="0" t="0"/>
-            <wp:docPr id="2" name="image5.png"/>
+            <wp:docPr id="7" name="image3.png"/>
             <a:graphic>
               <a:graphicData uri="http://schemas.openxmlformats.org/drawingml/2006/picture">
                 <pic:pic>
                   <pic:nvPicPr>
-                    <pic:cNvPr id="0" name="image5.png"/>
+                    <pic:cNvPr id="0" name="image3.png"/>
                     <pic:cNvPicPr preferRelativeResize="0"/>
                   </pic:nvPicPr>
                   <pic:blipFill>
@@ -841,12 +854,12 @@
           <wp:inline distB="114300" distT="114300" distL="114300" distR="114300">
             <wp:extent cx="5943600" cy="4000500"/>
             <wp:effectExtent b="0" l="0" r="0" t="0"/>
-            <wp:docPr id="3" name="image2.png"/>
+            <wp:docPr id="8" name="image4.png"/>
             <a:graphic>
               <a:graphicData uri="http://schemas.openxmlformats.org/drawingml/2006/picture">
                 <pic:pic>
                   <pic:nvPicPr>
-                    <pic:cNvPr id="0" name="image2.png"/>
+                    <pic:cNvPr id="0" name="image4.png"/>
                     <pic:cNvPicPr preferRelativeResize="0"/>
                   </pic:nvPicPr>
                   <pic:blipFill>
@@ -996,12 +1009,12 @@
           <wp:inline distB="114300" distT="114300" distL="114300" distR="114300">
             <wp:extent cx="5943600" cy="3746500"/>
             <wp:effectExtent b="0" l="0" r="0" t="0"/>
-            <wp:docPr id="6" name="image3.png"/>
+            <wp:docPr id="2" name="image7.png"/>
             <a:graphic>
               <a:graphicData uri="http://schemas.openxmlformats.org/drawingml/2006/picture">
                 <pic:pic>
                   <pic:nvPicPr>
-                    <pic:cNvPr id="0" name="image3.png"/>
+                    <pic:cNvPr id="0" name="image7.png"/>
                     <pic:cNvPicPr preferRelativeResize="0"/>
                   </pic:nvPicPr>
                   <pic:blipFill>
@@ -1142,12 +1155,12 @@
           <wp:inline distB="114300" distT="114300" distL="114300" distR="114300">
             <wp:extent cx="5124450" cy="4991100"/>
             <wp:effectExtent b="0" l="0" r="0" t="0"/>
-            <wp:docPr id="7" name="image7.png"/>
+            <wp:docPr id="3" name="image8.png"/>
             <a:graphic>
               <a:graphicData uri="http://schemas.openxmlformats.org/drawingml/2006/picture">
                 <pic:pic>
                   <pic:nvPicPr>
-                    <pic:cNvPr id="0" name="image7.png"/>
+                    <pic:cNvPr id="0" name="image8.png"/>
                     <pic:cNvPicPr preferRelativeResize="0"/>
                   </pic:nvPicPr>
                   <pic:blipFill>
@@ -1286,12 +1299,12 @@
           <wp:inline distB="114300" distT="114300" distL="114300" distR="114300">
             <wp:extent cx="5810250" cy="5257800"/>
             <wp:effectExtent b="0" l="0" r="0" t="0"/>
-            <wp:docPr id="8" name="image6.png"/>
+            <wp:docPr id="10" name="image9.png"/>
             <a:graphic>
               <a:graphicData uri="http://schemas.openxmlformats.org/drawingml/2006/picture">
                 <pic:pic>
                   <pic:nvPicPr>
-                    <pic:cNvPr id="0" name="image6.png"/>
+                    <pic:cNvPr id="0" name="image9.png"/>
                     <pic:cNvPicPr preferRelativeResize="0"/>
                   </pic:nvPicPr>
                   <pic:blipFill>
@@ -1450,12 +1463,12 @@
           <wp:inline distB="114300" distT="114300" distL="114300" distR="114300">
             <wp:extent cx="4229100" cy="2209800"/>
             <wp:effectExtent b="0" l="0" r="0" t="0"/>
-            <wp:docPr id="10" name="image1.png"/>
+            <wp:docPr id="5" name="image6.png"/>
             <a:graphic>
               <a:graphicData uri="http://schemas.openxmlformats.org/drawingml/2006/picture">
                 <pic:pic>
                   <pic:nvPicPr>
-                    <pic:cNvPr id="0" name="image1.png"/>
+                    <pic:cNvPr id="0" name="image6.png"/>
                     <pic:cNvPicPr preferRelativeResize="0"/>
                   </pic:nvPicPr>
                   <pic:blipFill>
@@ -1496,12 +1509,12 @@
           <wp:inline distB="114300" distT="114300" distL="114300" distR="114300">
             <wp:extent cx="3400425" cy="2809875"/>
             <wp:effectExtent b="0" l="0" r="0" t="0"/>
-            <wp:docPr id="5" name="image4.png"/>
+            <wp:docPr id="9" name="image1.png"/>
             <a:graphic>
               <a:graphicData uri="http://schemas.openxmlformats.org/drawingml/2006/picture">
                 <pic:pic>
                   <pic:nvPicPr>
-                    <pic:cNvPr id="0" name="image4.png"/>
+                    <pic:cNvPr id="0" name="image1.png"/>
                     <pic:cNvPicPr preferRelativeResize="0"/>
                   </pic:nvPicPr>
                   <pic:blipFill>
@@ -1542,12 +1555,12 @@
           <wp:inline distB="114300" distT="114300" distL="114300" distR="114300">
             <wp:extent cx="5943600" cy="1765300"/>
             <wp:effectExtent b="0" l="0" r="0" t="0"/>
-            <wp:docPr id="4" name="image9.png"/>
+            <wp:docPr id="1" name="image10.png"/>
             <a:graphic>
               <a:graphicData uri="http://schemas.openxmlformats.org/drawingml/2006/picture">
                 <pic:pic>
                   <pic:nvPicPr>
-                    <pic:cNvPr id="0" name="image9.png"/>
+                    <pic:cNvPr id="0" name="image10.png"/>
                     <pic:cNvPicPr preferRelativeResize="0"/>
                   </pic:nvPicPr>
                   <pic:blipFill>
@@ -1635,6 +1648,1005 @@
         <w:t xml:space="preserve">Also those with higher active seasons have higher spend besides the “low rank” players whose lower spend can be attributed to caring less about cosmetics and learning the game more before they spend more money.</w:t>
       </w:r>
     </w:p>
+    <w:p>
+      <w:pPr>
+        <w:ind w:left="0" w:firstLine="0"/>
+        <w:rPr/>
+      </w:pPr>
+      <w:r>
+        <w:rPr>
+          <w:rtl w:val="0"/>
+        </w:rPr>
+      </w:r>
+    </w:p>
+    <w:p>
+      <w:pPr>
+        <w:spacing w:after="240" w:before="240" w:lineRule="auto"/>
+        <w:rPr/>
+      </w:pPr>
+      <w:r>
+        <w:rPr>
+          <w:rtl w:val="0"/>
+        </w:rPr>
+        <w:t xml:space="preserve">Here's the rewritten version:</w:t>
+      </w:r>
+    </w:p>
+    <w:p>
+      <w:pPr>
+        <w:rPr/>
+      </w:pPr>
+      <w:r>
+        <w:pict>
+          <v:rect style="width:0.0pt;height:1.5pt" o:hr="t" o:hrstd="t" o:hralign="center" fillcolor="#A0A0A0" stroked="f"/>
+        </w:pict>
+      </w:r>
+      <w:r>
+        <w:rPr>
+          <w:rtl w:val="0"/>
+        </w:rPr>
+      </w:r>
+    </w:p>
+    <w:p>
+      <w:pPr>
+        <w:pStyle w:val="Heading2"/>
+        <w:keepNext w:val="0"/>
+        <w:keepLines w:val="0"/>
+        <w:spacing w:after="80" w:lineRule="auto"/>
+        <w:rPr>
+          <w:b w:val="1"/>
+          <w:bCs w:val="1"/>
+          <w:sz w:val="34"/>
+          <w:szCs w:val="34"/>
+        </w:rPr>
+      </w:pPr>
+      <w:bookmarkStart w:colFirst="0" w:colLast="0" w:name="_slwilx83nv36" w:id="1"/>
+      <w:bookmarkEnd w:id="1"/>
+      <w:r>
+        <w:rPr>
+          <w:b w:val="1"/>
+          <w:bCs w:val="1"/>
+          <w:sz w:val="34"/>
+          <w:szCs w:val="34"/>
+          <w:rtl w:val="0"/>
+        </w:rPr>
+        <w:t xml:space="preserve">Random Forest Modeling: Spend Propensity and Spend Amount</w:t>
+      </w:r>
+    </w:p>
+    <w:p>
+      <w:pPr>
+        <w:spacing w:after="240" w:before="240" w:lineRule="auto"/>
+        <w:rPr/>
+      </w:pPr>
+      <w:r>
+        <w:rPr>
+          <w:rtl w:val="0"/>
+        </w:rPr>
+        <w:t xml:space="preserve">After the exploratory analysis, correlation heatmap, and SQL segmentation, I ran two Random Forest models to test whether player behavior could predict monetization outcomes. The goal was to move beyond description and evaluate whether SQL patterns held up under prediction.</w:t>
+      </w:r>
+    </w:p>
+    <w:p>
+      <w:pPr>
+        <w:spacing w:after="240" w:before="240" w:lineRule="auto"/>
+        <w:rPr/>
+      </w:pPr>
+      <w:r>
+        <w:rPr>
+          <w:rtl w:val="0"/>
+        </w:rPr>
+        <w:t xml:space="preserve">The modeling addresses two separate business questions:</w:t>
+      </w:r>
+    </w:p>
+    <w:p>
+      <w:pPr>
+        <w:numPr>
+          <w:ilvl w:val="0"/>
+          <w:numId w:val="3"/>
+        </w:numPr>
+        <w:spacing w:after="0" w:afterAutospacing="0" w:before="240" w:lineRule="auto"/>
+        <w:ind w:left="720" w:hanging="360"/>
+      </w:pPr>
+      <w:r>
+        <w:rPr>
+          <w:rtl w:val="0"/>
+        </w:rPr>
+        <w:t xml:space="preserve">Will a player spend at all?</w:t>
+      </w:r>
+    </w:p>
+    <w:p>
+      <w:pPr>
+        <w:numPr>
+          <w:ilvl w:val="0"/>
+          <w:numId w:val="3"/>
+        </w:numPr>
+        <w:spacing w:after="240" w:before="0" w:beforeAutospacing="0" w:lineRule="auto"/>
+        <w:ind w:left="720" w:hanging="360"/>
+      </w:pPr>
+      <w:r>
+        <w:rPr>
+          <w:rtl w:val="0"/>
+        </w:rPr>
+        <w:t xml:space="preserve">If a player spends, how much?</w:t>
+      </w:r>
+    </w:p>
+    <w:p>
+      <w:pPr>
+        <w:spacing w:after="240" w:before="240" w:lineRule="auto"/>
+        <w:rPr/>
+      </w:pPr>
+      <w:r>
+        <w:rPr>
+          <w:rtl w:val="0"/>
+        </w:rPr>
+        <w:t xml:space="preserve">This separation matters because free-to-play spending is lopsided. Most players never buy anything; a small group drives most revenue. Predicting conversion is a different problem from predicting spend depth.</w:t>
+      </w:r>
+    </w:p>
+    <w:p>
+      <w:pPr>
+        <w:rPr/>
+      </w:pPr>
+      <w:r>
+        <w:pict>
+          <v:rect style="width:0.0pt;height:1.5pt" o:hr="t" o:hrstd="t" o:hralign="center" fillcolor="#A0A0A0" stroked="f"/>
+        </w:pict>
+      </w:r>
+      <w:r>
+        <w:rPr>
+          <w:rtl w:val="0"/>
+        </w:rPr>
+      </w:r>
+    </w:p>
+    <w:p>
+      <w:pPr>
+        <w:pStyle w:val="Heading3"/>
+        <w:keepNext w:val="0"/>
+        <w:keepLines w:val="0"/>
+        <w:spacing w:before="280" w:lineRule="auto"/>
+        <w:rPr>
+          <w:b w:val="1"/>
+          <w:bCs w:val="1"/>
+          <w:color w:val="000000"/>
+          <w:sz w:val="26"/>
+          <w:szCs w:val="26"/>
+        </w:rPr>
+      </w:pPr>
+      <w:bookmarkStart w:colFirst="0" w:colLast="0" w:name="_rl2o4njb064a" w:id="2"/>
+      <w:bookmarkEnd w:id="2"/>
+      <w:r>
+        <w:rPr>
+          <w:b w:val="1"/>
+          <w:bCs w:val="1"/>
+          <w:color w:val="000000"/>
+          <w:sz w:val="26"/>
+          <w:szCs w:val="26"/>
+          <w:rtl w:val="0"/>
+        </w:rPr>
+        <w:t xml:space="preserve">Model 1: Spend Propensity Classification</w:t>
+      </w:r>
+    </w:p>
+    <w:p>
+      <w:pPr>
+        <w:spacing w:after="240" w:before="240" w:lineRule="auto"/>
+        <w:rPr/>
+      </w:pPr>
+      <w:r>
+        <w:rPr>
+          <w:rtl w:val="0"/>
+        </w:rPr>
+        <w:t xml:space="preserve">The classifier predicts whether a player spends, using </w:t>
+      </w:r>
+      <w:r>
+        <w:rPr>
+          <w:rFonts w:ascii="Roboto Mono" w:cs="Roboto Mono" w:eastAsia="Roboto Mono" w:hAnsi="Roboto Mono"/>
+          <w:color w:val="188038"/>
+          <w:rtl w:val="0"/>
+        </w:rPr>
+        <w:t xml:space="preserve">is_spender</w:t>
+      </w:r>
+      <w:r>
+        <w:rPr>
+          <w:rtl w:val="0"/>
+        </w:rPr>
+        <w:t xml:space="preserve"> as the target (</w:t>
+      </w:r>
+      <w:r>
+        <w:rPr>
+          <w:rFonts w:ascii="Roboto Mono" w:cs="Roboto Mono" w:eastAsia="Roboto Mono" w:hAnsi="Roboto Mono"/>
+          <w:color w:val="188038"/>
+          <w:rtl w:val="0"/>
+        </w:rPr>
+        <w:t xml:space="preserve">total_spend &gt; 0</w:t>
+      </w:r>
+      <w:r>
+        <w:rPr>
+          <w:rtl w:val="0"/>
+        </w:rPr>
+        <w:t xml:space="preserve">). I excluded spend-derived variables (transaction count, recency, average spend per transaction, max single transaction) to prevent data leakage. The model learns from behavior, not from spending history.</w:t>
+      </w:r>
+    </w:p>
+    <w:p>
+      <w:pPr>
+        <w:spacing w:after="240" w:before="240" w:lineRule="auto"/>
+        <w:rPr>
+          <w:b w:val="1"/>
+          <w:bCs w:val="1"/>
+        </w:rPr>
+      </w:pPr>
+      <w:r>
+        <w:rPr>
+          <w:b w:val="1"/>
+          <w:bCs w:val="1"/>
+          <w:rtl w:val="0"/>
+        </w:rPr>
+        <w:t xml:space="preserve">ROC-AUC: 0.7316</w:t>
+      </w:r>
+    </w:p>
+    <w:p>
+      <w:pPr>
+        <w:spacing w:after="240" w:before="240" w:lineRule="auto"/>
+        <w:rPr/>
+      </w:pPr>
+      <w:r>
+        <w:rPr>
+          <w:rtl w:val="0"/>
+        </w:rPr>
+        <w:t xml:space="preserve">The model distinguishes spenders from non-spenders with moderate accuracy. Errors in both directions are expected since player spending depends on factors the behavioral data doesn't capture.</w:t>
+      </w:r>
+    </w:p>
+    <w:p>
+      <w:pPr>
+        <w:spacing w:after="240" w:before="240" w:lineRule="auto"/>
+        <w:rPr/>
+      </w:pPr>
+      <w:r>
+        <w:rPr>
+          <w:rtl w:val="0"/>
+        </w:rPr>
+        <w:t xml:space="preserve">Top features by importance:</w:t>
+      </w:r>
+    </w:p>
+    <w:p>
+      <w:pPr>
+        <w:numPr>
+          <w:ilvl w:val="0"/>
+          <w:numId w:val="1"/>
+        </w:numPr>
+        <w:spacing w:after="0" w:afterAutospacing="0" w:before="240" w:lineRule="auto"/>
+        <w:ind w:left="720" w:hanging="360"/>
+      </w:pPr>
+      <w:r>
+        <w:rPr>
+          <w:rFonts w:ascii="Roboto Mono" w:cs="Roboto Mono" w:eastAsia="Roboto Mono" w:hAnsi="Roboto Mono"/>
+          <w:color w:val="188038"/>
+          <w:rtl w:val="0"/>
+        </w:rPr>
+        <w:t xml:space="preserve">avg_retention</w:t>
+      </w:r>
+    </w:p>
+    <w:p>
+      <w:pPr>
+        <w:numPr>
+          <w:ilvl w:val="0"/>
+          <w:numId w:val="1"/>
+        </w:numPr>
+        <w:spacing w:after="0" w:afterAutospacing="0" w:before="0" w:beforeAutospacing="0" w:lineRule="auto"/>
+        <w:ind w:left="720" w:hanging="360"/>
+      </w:pPr>
+      <w:r>
+        <w:rPr>
+          <w:rFonts w:ascii="Roboto Mono" w:cs="Roboto Mono" w:eastAsia="Roboto Mono" w:hAnsi="Roboto Mono"/>
+          <w:color w:val="188038"/>
+          <w:rtl w:val="0"/>
+        </w:rPr>
+        <w:t xml:space="preserve">account_age_days</w:t>
+      </w:r>
+    </w:p>
+    <w:p>
+      <w:pPr>
+        <w:numPr>
+          <w:ilvl w:val="0"/>
+          <w:numId w:val="1"/>
+        </w:numPr>
+        <w:spacing w:after="0" w:afterAutospacing="0" w:before="0" w:beforeAutospacing="0" w:lineRule="auto"/>
+        <w:ind w:left="720" w:hanging="360"/>
+      </w:pPr>
+      <w:r>
+        <w:rPr>
+          <w:rFonts w:ascii="Roboto Mono" w:cs="Roboto Mono" w:eastAsia="Roboto Mono" w:hAnsi="Roboto Mono"/>
+          <w:color w:val="188038"/>
+          <w:rtl w:val="0"/>
+        </w:rPr>
+        <w:t xml:space="preserve">seasons_active</w:t>
+      </w:r>
+    </w:p>
+    <w:p>
+      <w:pPr>
+        <w:numPr>
+          <w:ilvl w:val="0"/>
+          <w:numId w:val="1"/>
+        </w:numPr>
+        <w:spacing w:after="0" w:afterAutospacing="0" w:before="0" w:beforeAutospacing="0" w:lineRule="auto"/>
+        <w:ind w:left="720" w:hanging="360"/>
+      </w:pPr>
+      <w:r>
+        <w:rPr>
+          <w:rFonts w:ascii="Roboto Mono" w:cs="Roboto Mono" w:eastAsia="Roboto Mono" w:hAnsi="Roboto Mono"/>
+          <w:color w:val="188038"/>
+          <w:rtl w:val="0"/>
+        </w:rPr>
+        <w:t xml:space="preserve">cohort_year</w:t>
+      </w:r>
+    </w:p>
+    <w:p>
+      <w:pPr>
+        <w:numPr>
+          <w:ilvl w:val="0"/>
+          <w:numId w:val="1"/>
+        </w:numPr>
+        <w:spacing w:after="240" w:before="0" w:beforeAutospacing="0" w:lineRule="auto"/>
+        <w:ind w:left="720" w:hanging="360"/>
+      </w:pPr>
+      <w:r>
+        <w:rPr>
+          <w:rFonts w:ascii="Roboto Mono" w:cs="Roboto Mono" w:eastAsia="Roboto Mono" w:hAnsi="Roboto Mono"/>
+          <w:color w:val="188038"/>
+          <w:rtl w:val="0"/>
+        </w:rPr>
+        <w:t xml:space="preserve">avg_session_mins</w:t>
+      </w:r>
+    </w:p>
+    <w:p>
+      <w:pPr>
+        <w:spacing w:after="240" w:before="240" w:lineRule="auto"/>
+        <w:rPr/>
+      </w:pPr>
+      <w:r>
+        <w:rPr>
+          <w:rtl w:val="0"/>
+        </w:rPr>
+        <w:t xml:space="preserve">Retention ranked first. Players who stay engaged convert at higher rates. Account age and seasons active followed, which ties monetization to long-term engagement rather than short-term activity spikes. Players active across multiple seasons accumulate more exposure to cosmetics, battle passes, and event offers.</w:t>
+      </w:r>
+    </w:p>
+    <w:p>
+      <w:pPr>
+        <w:spacing w:after="240" w:before="240" w:lineRule="auto"/>
+        <w:rPr/>
+      </w:pPr>
+      <w:r>
+        <w:rPr>
+          <w:rFonts w:ascii="Roboto Mono" w:cs="Roboto Mono" w:eastAsia="Roboto Mono" w:hAnsi="Roboto Mono"/>
+          <w:color w:val="188038"/>
+          <w:rtl w:val="0"/>
+        </w:rPr>
+        <w:t xml:space="preserve">is_esports_watcher</w:t>
+      </w:r>
+      <w:r>
+        <w:rPr>
+          <w:rtl w:val="0"/>
+        </w:rPr>
+        <w:t xml:space="preserve"> ranked low in feature importance, even though SQL showed esports watchers have higher average spend and a higher spender rate. This suggests esports watching predicts spending indirectly, through retention, account age, and seasons active, not on its own. Esports watchers may spend more because they're more engaged overall, not because watching esports triggers purchases.</w:t>
+      </w:r>
+    </w:p>
+    <w:p>
+      <w:pPr>
+        <w:rPr/>
+      </w:pPr>
+      <w:r>
+        <w:pict>
+          <v:rect style="width:0.0pt;height:1.5pt" o:hr="t" o:hrstd="t" o:hralign="center" fillcolor="#A0A0A0" stroked="f"/>
+        </w:pict>
+      </w:r>
+      <w:r>
+        <w:rPr>
+          <w:rtl w:val="0"/>
+        </w:rPr>
+      </w:r>
+    </w:p>
+    <w:p>
+      <w:pPr>
+        <w:pStyle w:val="Heading3"/>
+        <w:keepNext w:val="0"/>
+        <w:keepLines w:val="0"/>
+        <w:spacing w:before="280" w:lineRule="auto"/>
+        <w:rPr>
+          <w:b w:val="1"/>
+          <w:bCs w:val="1"/>
+          <w:color w:val="000000"/>
+          <w:sz w:val="26"/>
+          <w:szCs w:val="26"/>
+        </w:rPr>
+      </w:pPr>
+      <w:bookmarkStart w:colFirst="0" w:colLast="0" w:name="_48436bjkp2sn" w:id="3"/>
+      <w:bookmarkEnd w:id="3"/>
+      <w:r>
+        <w:rPr>
+          <w:b w:val="1"/>
+          <w:bCs w:val="1"/>
+          <w:color w:val="000000"/>
+          <w:sz w:val="26"/>
+          <w:szCs w:val="26"/>
+          <w:rtl w:val="0"/>
+        </w:rPr>
+        <w:t xml:space="preserve">Model 2: Spend Amount Regression</w:t>
+      </w:r>
+    </w:p>
+    <w:p>
+      <w:pPr>
+        <w:spacing w:after="240" w:before="240" w:lineRule="auto"/>
+        <w:rPr/>
+      </w:pPr>
+      <w:r>
+        <w:rPr>
+          <w:rtl w:val="0"/>
+        </w:rPr>
+        <w:t xml:space="preserve">The regressor predicts </w:t>
+      </w:r>
+      <w:r>
+        <w:rPr>
+          <w:rFonts w:ascii="Roboto Mono" w:cs="Roboto Mono" w:eastAsia="Roboto Mono" w:hAnsi="Roboto Mono"/>
+          <w:color w:val="188038"/>
+          <w:rtl w:val="0"/>
+        </w:rPr>
+        <w:t xml:space="preserve">total_spend</w:t>
+      </w:r>
+      <w:r>
+        <w:rPr>
+          <w:rtl w:val="0"/>
+        </w:rPr>
+        <w:t xml:space="preserve"> among spenders only. Non-spenders have a spend of zero, which makes a regression on the full population less useful. The same leakage exclusions apply.</w:t>
+      </w:r>
+    </w:p>
+    <w:p>
+      <w:pPr>
+        <w:spacing w:after="240" w:before="240" w:lineRule="auto"/>
+        <w:rPr>
+          <w:b w:val="1"/>
+          <w:bCs w:val="1"/>
+        </w:rPr>
+      </w:pPr>
+      <w:r>
+        <w:rPr>
+          <w:b w:val="1"/>
+          <w:bCs w:val="1"/>
+          <w:rtl w:val="0"/>
+        </w:rPr>
+        <w:t xml:space="preserve">R²: 0.1079 | MAE: $695 | RMSE: $1,361</w:t>
+      </w:r>
+    </w:p>
+    <w:p>
+      <w:pPr>
+        <w:spacing w:after="240" w:before="240" w:lineRule="auto"/>
+        <w:rPr/>
+      </w:pPr>
+      <w:r>
+        <w:rPr>
+          <w:rtl w:val="0"/>
+        </w:rPr>
+        <w:t xml:space="preserve">The low R² means behavioral features explain a small fraction of spend variance. Behavior predicts conversion more reliably than it predicts spend depth.</w:t>
+      </w:r>
+    </w:p>
+    <w:p>
+      <w:pPr>
+        <w:spacing w:after="240" w:before="240" w:lineRule="auto"/>
+        <w:rPr/>
+      </w:pPr>
+      <w:r>
+        <w:rPr>
+          <w:rtl w:val="0"/>
+        </w:rPr>
+        <w:t xml:space="preserve">This fits how free-to-play monetization works. Spend amount depends on cosmetic preferences, bundle pricing, limited-time offers, personal income, and emotional attachment to specific skins. None of that shows up in behavioral logs.</w:t>
+      </w:r>
+    </w:p>
+    <w:p>
+      <w:pPr>
+        <w:spacing w:after="240" w:before="240" w:lineRule="auto"/>
+        <w:rPr/>
+      </w:pPr>
+      <w:r>
+        <w:rPr>
+          <w:rtl w:val="0"/>
+        </w:rPr>
+        <w:t xml:space="preserve">Top features by importance:</w:t>
+      </w:r>
+    </w:p>
+    <w:p>
+      <w:pPr>
+        <w:numPr>
+          <w:ilvl w:val="0"/>
+          <w:numId w:val="4"/>
+        </w:numPr>
+        <w:spacing w:after="0" w:afterAutospacing="0" w:before="240" w:lineRule="auto"/>
+        <w:ind w:left="720" w:hanging="360"/>
+      </w:pPr>
+      <w:r>
+        <w:rPr>
+          <w:rFonts w:ascii="Roboto Mono" w:cs="Roboto Mono" w:eastAsia="Roboto Mono" w:hAnsi="Roboto Mono"/>
+          <w:color w:val="188038"/>
+          <w:rtl w:val="0"/>
+        </w:rPr>
+        <w:t xml:space="preserve">account_age_days</w:t>
+      </w:r>
+    </w:p>
+    <w:p>
+      <w:pPr>
+        <w:numPr>
+          <w:ilvl w:val="0"/>
+          <w:numId w:val="4"/>
+        </w:numPr>
+        <w:spacing w:after="0" w:afterAutospacing="0" w:before="0" w:beforeAutospacing="0" w:lineRule="auto"/>
+        <w:ind w:left="720" w:hanging="360"/>
+      </w:pPr>
+      <w:r>
+        <w:rPr>
+          <w:rFonts w:ascii="Roboto Mono" w:cs="Roboto Mono" w:eastAsia="Roboto Mono" w:hAnsi="Roboto Mono"/>
+          <w:color w:val="188038"/>
+          <w:rtl w:val="0"/>
+        </w:rPr>
+        <w:t xml:space="preserve">avg_retention</w:t>
+      </w:r>
+    </w:p>
+    <w:p>
+      <w:pPr>
+        <w:numPr>
+          <w:ilvl w:val="0"/>
+          <w:numId w:val="4"/>
+        </w:numPr>
+        <w:spacing w:after="0" w:afterAutospacing="0" w:before="0" w:beforeAutospacing="0" w:lineRule="auto"/>
+        <w:ind w:left="720" w:hanging="360"/>
+      </w:pPr>
+      <w:r>
+        <w:rPr>
+          <w:rFonts w:ascii="Roboto Mono" w:cs="Roboto Mono" w:eastAsia="Roboto Mono" w:hAnsi="Roboto Mono"/>
+          <w:color w:val="188038"/>
+          <w:rtl w:val="0"/>
+        </w:rPr>
+        <w:t xml:space="preserve">avg_esports_watch_hrs</w:t>
+      </w:r>
+    </w:p>
+    <w:p>
+      <w:pPr>
+        <w:numPr>
+          <w:ilvl w:val="0"/>
+          <w:numId w:val="4"/>
+        </w:numPr>
+        <w:spacing w:after="0" w:afterAutospacing="0" w:before="0" w:beforeAutospacing="0" w:lineRule="auto"/>
+        <w:ind w:left="720" w:hanging="360"/>
+      </w:pPr>
+      <w:r>
+        <w:rPr>
+          <w:rFonts w:ascii="Roboto Mono" w:cs="Roboto Mono" w:eastAsia="Roboto Mono" w:hAnsi="Roboto Mono"/>
+          <w:color w:val="188038"/>
+          <w:rtl w:val="0"/>
+        </w:rPr>
+        <w:t xml:space="preserve">avg_session_mins</w:t>
+      </w:r>
+    </w:p>
+    <w:p>
+      <w:pPr>
+        <w:numPr>
+          <w:ilvl w:val="0"/>
+          <w:numId w:val="4"/>
+        </w:numPr>
+        <w:spacing w:after="0" w:afterAutospacing="0" w:before="0" w:beforeAutospacing="0" w:lineRule="auto"/>
+        <w:ind w:left="720" w:hanging="360"/>
+      </w:pPr>
+      <w:r>
+        <w:rPr>
+          <w:rFonts w:ascii="Roboto Mono" w:cs="Roboto Mono" w:eastAsia="Roboto Mono" w:hAnsi="Roboto Mono"/>
+          <w:color w:val="188038"/>
+          <w:rtl w:val="0"/>
+        </w:rPr>
+        <w:t xml:space="preserve">avg_rank_score</w:t>
+      </w:r>
+    </w:p>
+    <w:p>
+      <w:pPr>
+        <w:numPr>
+          <w:ilvl w:val="0"/>
+          <w:numId w:val="4"/>
+        </w:numPr>
+        <w:spacing w:after="240" w:before="0" w:beforeAutospacing="0" w:lineRule="auto"/>
+        <w:ind w:left="720" w:hanging="360"/>
+      </w:pPr>
+      <w:r>
+        <w:rPr>
+          <w:rFonts w:ascii="Roboto Mono" w:cs="Roboto Mono" w:eastAsia="Roboto Mono" w:hAnsi="Roboto Mono"/>
+          <w:color w:val="188038"/>
+          <w:rtl w:val="0"/>
+        </w:rPr>
+        <w:t xml:space="preserve">avg_sessions_per_week</w:t>
+      </w:r>
+    </w:p>
+    <w:p>
+      <w:pPr>
+        <w:spacing w:after="240" w:before="240" w:lineRule="auto"/>
+        <w:rPr/>
+      </w:pPr>
+      <w:r>
+        <w:rPr>
+          <w:rtl w:val="0"/>
+        </w:rPr>
+        <w:t xml:space="preserve">Account age ranked first. Longer-tenured players spend more. </w:t>
+      </w:r>
+      <w:r>
+        <w:rPr>
+          <w:rFonts w:ascii="Roboto Mono" w:cs="Roboto Mono" w:eastAsia="Roboto Mono" w:hAnsi="Roboto Mono"/>
+          <w:color w:val="188038"/>
+          <w:rtl w:val="0"/>
+        </w:rPr>
+        <w:t xml:space="preserve">avg_esports_watch_hrs</w:t>
+      </w:r>
+      <w:r>
+        <w:rPr>
+          <w:rtl w:val="0"/>
+        </w:rPr>
+        <w:t xml:space="preserve"> ranked third, which is a shift from Model 1, where </w:t>
+      </w:r>
+      <w:r>
+        <w:rPr>
+          <w:rFonts w:ascii="Roboto Mono" w:cs="Roboto Mono" w:eastAsia="Roboto Mono" w:hAnsi="Roboto Mono"/>
+          <w:color w:val="188038"/>
+          <w:rtl w:val="0"/>
+        </w:rPr>
+        <w:t xml:space="preserve">is_esports_watcher</w:t>
+      </w:r>
+      <w:r>
+        <w:rPr>
+          <w:rtl w:val="0"/>
+        </w:rPr>
+        <w:t xml:space="preserve"> ranked low. Binary esports watcher status doesn't move the needle on conversion, but hours watched predicts spend amount among players who already pay. Deeper ecosystem involvement correlates with higher player value.</w:t>
+      </w:r>
+    </w:p>
+    <w:p>
+      <w:pPr>
+        <w:rPr/>
+      </w:pPr>
+      <w:r>
+        <w:pict>
+          <v:rect style="width:0.0pt;height:1.5pt" o:hr="t" o:hrstd="t" o:hralign="center" fillcolor="#A0A0A0" stroked="f"/>
+        </w:pict>
+      </w:r>
+      <w:r>
+        <w:rPr>
+          <w:rtl w:val="0"/>
+        </w:rPr>
+      </w:r>
+    </w:p>
+    <w:p>
+      <w:pPr>
+        <w:pStyle w:val="Heading3"/>
+        <w:keepNext w:val="0"/>
+        <w:keepLines w:val="0"/>
+        <w:spacing w:before="280" w:lineRule="auto"/>
+        <w:rPr>
+          <w:b w:val="1"/>
+          <w:bCs w:val="1"/>
+          <w:color w:val="000000"/>
+          <w:sz w:val="26"/>
+          <w:szCs w:val="26"/>
+        </w:rPr>
+      </w:pPr>
+      <w:bookmarkStart w:colFirst="0" w:colLast="0" w:name="_jkminchbdbfg" w:id="4"/>
+      <w:bookmarkEnd w:id="4"/>
+      <w:r>
+        <w:rPr>
+          <w:b w:val="1"/>
+          <w:bCs w:val="1"/>
+          <w:color w:val="000000"/>
+          <w:sz w:val="26"/>
+          <w:szCs w:val="26"/>
+          <w:rtl w:val="0"/>
+        </w:rPr>
+        <w:t xml:space="preserve">Interpretation</w:t>
+      </w:r>
+    </w:p>
+    <w:p>
+      <w:pPr>
+        <w:spacing w:after="240" w:before="240" w:lineRule="auto"/>
+        <w:rPr/>
+      </w:pPr>
+      <w:r>
+        <w:rPr>
+          <w:rtl w:val="0"/>
+        </w:rPr>
+        <w:t xml:space="preserve">The models validate and extend the SQL findings. SQL showed that esports watchers, high-agent-diversity players, and long-session players had stronger spending patterns. The Random Forest adds weighting: which features matter most when all are considered together.</w:t>
+      </w:r>
+    </w:p>
+    <w:p>
+      <w:pPr>
+        <w:spacing w:after="240" w:before="240" w:lineRule="auto"/>
+        <w:rPr/>
+      </w:pPr>
+      <w:r>
+        <w:rPr>
+          <w:rtl w:val="0"/>
+        </w:rPr>
+        <w:t xml:space="preserve">Classification outperformed regression. Identifying likely spenders is tractable; predicting exact dollar amounts is not. From a product standpoint, the model is useful for targeting monetization-ready users, not for individual revenue forecasting.</w:t>
+      </w:r>
+    </w:p>
+    <w:p>
+      <w:pPr>
+        <w:spacing w:after="240" w:before="240" w:lineRule="auto"/>
+        <w:rPr/>
+      </w:pPr>
+      <w:r>
+        <w:rPr>
+          <w:rtl w:val="0"/>
+        </w:rPr>
+        <w:t xml:space="preserve">Long-term engagement is the dominant monetization signal. Retention, account age, and seasons active appear consistently across both models. Acquisition campaigns that ignore retention are monetization campaigns that ignore their own foundation.</w:t>
+      </w:r>
+    </w:p>
+    <w:p>
+      <w:pPr>
+        <w:spacing w:after="240" w:before="240" w:lineRule="auto"/>
+        <w:rPr/>
+      </w:pPr>
+      <w:r>
+        <w:rPr>
+          <w:rtl w:val="0"/>
+        </w:rPr>
+        <w:t xml:space="preserve">Esports engagement functions as an ecosystem signal, not a purchase trigger. SQL showed watchers convert more; the Random Forest showed other engagement variables explain more of that conversion. Among spenders, watch hours predict spend depth. The practical read: esports engagement identifies high-value players better than first-time buyers.</w:t>
+      </w:r>
+    </w:p>
+    <w:p>
+      <w:pPr>
+        <w:rPr/>
+      </w:pPr>
+      <w:r>
+        <w:pict>
+          <v:rect style="width:0.0pt;height:1.5pt" o:hr="t" o:hrstd="t" o:hralign="center" fillcolor="#A0A0A0" stroked="f"/>
+        </w:pict>
+      </w:r>
+      <w:r>
+        <w:rPr>
+          <w:rtl w:val="0"/>
+        </w:rPr>
+      </w:r>
+    </w:p>
+    <w:p>
+      <w:pPr>
+        <w:pStyle w:val="Heading3"/>
+        <w:keepNext w:val="0"/>
+        <w:keepLines w:val="0"/>
+        <w:spacing w:before="280" w:lineRule="auto"/>
+        <w:rPr>
+          <w:b w:val="1"/>
+          <w:bCs w:val="1"/>
+          <w:color w:val="000000"/>
+          <w:sz w:val="26"/>
+          <w:szCs w:val="26"/>
+        </w:rPr>
+      </w:pPr>
+      <w:bookmarkStart w:colFirst="0" w:colLast="0" w:name="_82id1f3cdodl" w:id="5"/>
+      <w:bookmarkEnd w:id="5"/>
+      <w:r>
+        <w:rPr>
+          <w:b w:val="1"/>
+          <w:bCs w:val="1"/>
+          <w:color w:val="000000"/>
+          <w:sz w:val="26"/>
+          <w:szCs w:val="26"/>
+          <w:rtl w:val="0"/>
+        </w:rPr>
+        <w:t xml:space="preserve">Business Recommendations</w:t>
+      </w:r>
+    </w:p>
+    <w:p>
+      <w:pPr>
+        <w:spacing w:after="240" w:before="240" w:lineRule="auto"/>
+        <w:rPr/>
+      </w:pPr>
+      <w:r>
+        <w:rPr>
+          <w:b w:val="1"/>
+          <w:bCs w:val="1"/>
+          <w:rtl w:val="0"/>
+        </w:rPr>
+        <w:t xml:space="preserve">High-retention non-spenders</w:t>
+      </w:r>
+      <w:r>
+        <w:rPr>
+          <w:rtl w:val="0"/>
+        </w:rPr>
+        <w:t xml:space="preserve"> Retention is the strongest conversion predictor, so high-retention players who haven't purchased yet are the most actionable segment. Target them with first-purchase campaigns: beginner bundles, personalized store offers, limited-time discounts.</w:t>
+      </w:r>
+    </w:p>
+    <w:p>
+      <w:pPr>
+        <w:spacing w:after="240" w:before="240" w:lineRule="auto"/>
+        <w:rPr/>
+      </w:pPr>
+      <w:r>
+        <w:rPr>
+          <w:b w:val="1"/>
+          <w:bCs w:val="1"/>
+          <w:rtl w:val="0"/>
+        </w:rPr>
+        <w:t xml:space="preserve">Esports-engaged spenders</w:t>
+      </w:r>
+      <w:r>
+        <w:rPr>
+          <w:rtl w:val="0"/>
+        </w:rPr>
+        <w:t xml:space="preserve"> Players with high watch hours who already spend show higher revenue potential. VCT-themed cosmetics, team bundles, and event-based exclusives map directly to what this group cares about.</w:t>
+      </w:r>
+    </w:p>
+    <w:p>
+      <w:pPr>
+        <w:spacing w:after="240" w:before="240" w:lineRule="auto"/>
+        <w:rPr/>
+      </w:pPr>
+      <w:r>
+        <w:rPr>
+          <w:b w:val="1"/>
+          <w:bCs w:val="1"/>
+          <w:rtl w:val="0"/>
+        </w:rPr>
+        <w:t xml:space="preserve">Long-tenure, high-engagement players</w:t>
+      </w:r>
+      <w:r>
+        <w:rPr>
+          <w:rtl w:val="0"/>
+        </w:rPr>
+        <w:t xml:space="preserve"> Old accounts with strong retention, multiple active seasons, and long sessions represent the highest-value tier. Loyalty programs, premium cosmetics, and reactivation campaigns are the right tools if purchase frequency starts declining.</w:t>
+      </w:r>
+    </w:p>
+    <w:p>
+      <w:pPr>
+        <w:rPr/>
+      </w:pPr>
+      <w:r>
+        <w:pict>
+          <v:rect style="width:0.0pt;height:1.5pt" o:hr="t" o:hrstd="t" o:hralign="center" fillcolor="#A0A0A0" stroked="f"/>
+        </w:pict>
+      </w:r>
+      <w:r>
+        <w:rPr>
+          <w:rtl w:val="0"/>
+        </w:rPr>
+      </w:r>
+    </w:p>
+    <w:p>
+      <w:pPr>
+        <w:pStyle w:val="Heading3"/>
+        <w:keepNext w:val="0"/>
+        <w:keepLines w:val="0"/>
+        <w:spacing w:before="280" w:lineRule="auto"/>
+        <w:rPr>
+          <w:b w:val="1"/>
+          <w:bCs w:val="1"/>
+          <w:color w:val="000000"/>
+          <w:sz w:val="26"/>
+          <w:szCs w:val="26"/>
+        </w:rPr>
+      </w:pPr>
+      <w:bookmarkStart w:colFirst="0" w:colLast="0" w:name="_nevrkscvh8ox" w:id="6"/>
+      <w:bookmarkEnd w:id="6"/>
+      <w:r>
+        <w:rPr>
+          <w:b w:val="1"/>
+          <w:bCs w:val="1"/>
+          <w:color w:val="000000"/>
+          <w:sz w:val="26"/>
+          <w:szCs w:val="26"/>
+          <w:rtl w:val="0"/>
+        </w:rPr>
+        <w:t xml:space="preserve">Limitations</w:t>
+      </w:r>
+    </w:p>
+    <w:p>
+      <w:pPr>
+        <w:spacing w:after="240" w:before="240" w:lineRule="auto"/>
+        <w:rPr/>
+      </w:pPr>
+      <w:r>
+        <w:rPr>
+          <w:rtl w:val="0"/>
+        </w:rPr>
+        <w:t xml:space="preserve">The dataset is synthetic. Treat these results as a portfolio-level business simulation, not a model of real Riot player behavior.</w:t>
+      </w:r>
+    </w:p>
+    <w:p>
+      <w:pPr>
+        <w:spacing w:after="240" w:before="240" w:lineRule="auto"/>
+        <w:rPr/>
+      </w:pPr>
+      <w:r>
+        <w:rPr>
+          <w:rtl w:val="0"/>
+        </w:rPr>
+        <w:t xml:space="preserve">The behavioral features miss a lot: cosmetic preferences, income, store rotation, battle pass ownership, discount history, favorite agents and weapons. The regression's low R² reflects those gaps directly.</w:t>
+      </w:r>
+    </w:p>
+    <w:p>
+      <w:pPr>
+        <w:spacing w:after="240" w:before="240" w:lineRule="auto"/>
+        <w:rPr/>
+      </w:pPr>
+      <w:r>
+        <w:rPr>
+          <w:rtl w:val="0"/>
+        </w:rPr>
+        <w:t xml:space="preserve">Retention, account age, and seasons active all measure long-term engagement, so they're correlated. Random Forest splits importance across related features, which means the exact feature ranking is less meaningful than the cluster it represents.</w:t>
+      </w:r>
+    </w:p>
+    <w:p>
+      <w:pPr>
+        <w:rPr/>
+      </w:pPr>
+      <w:r>
+        <w:pict>
+          <v:rect style="width:0.0pt;height:1.5pt" o:hr="t" o:hrstd="t" o:hralign="center" fillcolor="#A0A0A0" stroked="f"/>
+        </w:pict>
+      </w:r>
+      <w:r>
+        <w:rPr>
+          <w:rtl w:val="0"/>
+        </w:rPr>
+      </w:r>
+    </w:p>
+    <w:p>
+      <w:pPr>
+        <w:pStyle w:val="Heading3"/>
+        <w:keepNext w:val="0"/>
+        <w:keepLines w:val="0"/>
+        <w:spacing w:before="280" w:lineRule="auto"/>
+        <w:rPr>
+          <w:b w:val="1"/>
+          <w:bCs w:val="1"/>
+          <w:color w:val="000000"/>
+          <w:sz w:val="26"/>
+          <w:szCs w:val="26"/>
+        </w:rPr>
+      </w:pPr>
+      <w:bookmarkStart w:colFirst="0" w:colLast="0" w:name="_5foxm0iws3ff" w:id="7"/>
+      <w:bookmarkEnd w:id="7"/>
+      <w:r>
+        <w:rPr>
+          <w:b w:val="1"/>
+          <w:bCs w:val="1"/>
+          <w:color w:val="000000"/>
+          <w:sz w:val="26"/>
+          <w:szCs w:val="26"/>
+          <w:rtl w:val="0"/>
+        </w:rPr>
+        <w:t xml:space="preserve">Conclusion</w:t>
+      </w:r>
+    </w:p>
+    <w:p>
+      <w:pPr>
+        <w:spacing w:after="240" w:before="240" w:lineRule="auto"/>
+        <w:rPr/>
+      </w:pPr>
+      <w:r>
+        <w:rPr>
+          <w:rtl w:val="0"/>
+        </w:rPr>
+        <w:t xml:space="preserve">Behavioral data predicts conversion better than spend amount. Retention, account age, and seasons active are the strongest signals across both models. Esports watch hours matter more for spend depth than for initial conversion.</w:t>
+      </w:r>
+    </w:p>
+    <w:p>
+      <w:pPr>
+        <w:spacing w:after="240" w:before="240" w:lineRule="auto"/>
+        <w:rPr/>
+      </w:pPr>
+      <w:r>
+        <w:rPr>
+          <w:rtl w:val="0"/>
+        </w:rPr>
+        <w:t xml:space="preserve">The central finding holds: monetization is a function of engagement. Players who stay active longer, play across more seasons, and participate more in the Valorant ecosystem become the most valuable customers. For a live-service title, retention strategy and monetization strategy are the same thing.</w:t>
+      </w:r>
+    </w:p>
+    <w:p>
+      <w:pPr>
+        <w:ind w:left="0" w:firstLine="0"/>
+        <w:rPr/>
+      </w:pPr>
+      <w:r>
+        <w:rPr>
+          <w:rtl w:val="0"/>
+        </w:rPr>
+      </w:r>
+    </w:p>
     <w:sectPr>
       <w:pgSz w:h="15840" w:w="12240" w:orient="portrait"/>
       <w:pgMar w:bottom="1440" w:top="1440" w:left="1440" w:right="1440" w:header="720" w:footer="720"/>
@@ -1649,6 +2661,116 @@
   <w:abstractNum w:abstractNumId="1">
     <w:lvl w:ilvl="0">
       <w:start w:val="1"/>
+      <w:numFmt w:val="bullet"/>
+      <w:lvlText w:val="●"/>
+      <w:lvlJc w:val="left"/>
+      <w:pPr>
+        <w:ind w:left="720" w:hanging="360"/>
+      </w:pPr>
+      <w:rPr>
+        <w:u w:val="none"/>
+      </w:rPr>
+    </w:lvl>
+    <w:lvl w:ilvl="1">
+      <w:start w:val="1"/>
+      <w:numFmt w:val="bullet"/>
+      <w:lvlText w:val="○"/>
+      <w:lvlJc w:val="left"/>
+      <w:pPr>
+        <w:ind w:left="1440" w:hanging="360"/>
+      </w:pPr>
+      <w:rPr>
+        <w:u w:val="none"/>
+      </w:rPr>
+    </w:lvl>
+    <w:lvl w:ilvl="2">
+      <w:start w:val="1"/>
+      <w:numFmt w:val="bullet"/>
+      <w:lvlText w:val="■"/>
+      <w:lvlJc w:val="left"/>
+      <w:pPr>
+        <w:ind w:left="2160" w:hanging="360"/>
+      </w:pPr>
+      <w:rPr>
+        <w:u w:val="none"/>
+      </w:rPr>
+    </w:lvl>
+    <w:lvl w:ilvl="3">
+      <w:start w:val="1"/>
+      <w:numFmt w:val="bullet"/>
+      <w:lvlText w:val="●"/>
+      <w:lvlJc w:val="left"/>
+      <w:pPr>
+        <w:ind w:left="2880" w:hanging="360"/>
+      </w:pPr>
+      <w:rPr>
+        <w:u w:val="none"/>
+      </w:rPr>
+    </w:lvl>
+    <w:lvl w:ilvl="4">
+      <w:start w:val="1"/>
+      <w:numFmt w:val="bullet"/>
+      <w:lvlText w:val="○"/>
+      <w:lvlJc w:val="left"/>
+      <w:pPr>
+        <w:ind w:left="3600" w:hanging="360"/>
+      </w:pPr>
+      <w:rPr>
+        <w:u w:val="none"/>
+      </w:rPr>
+    </w:lvl>
+    <w:lvl w:ilvl="5">
+      <w:start w:val="1"/>
+      <w:numFmt w:val="bullet"/>
+      <w:lvlText w:val="■"/>
+      <w:lvlJc w:val="left"/>
+      <w:pPr>
+        <w:ind w:left="4320" w:hanging="360"/>
+      </w:pPr>
+      <w:rPr>
+        <w:u w:val="none"/>
+      </w:rPr>
+    </w:lvl>
+    <w:lvl w:ilvl="6">
+      <w:start w:val="1"/>
+      <w:numFmt w:val="bullet"/>
+      <w:lvlText w:val="●"/>
+      <w:lvlJc w:val="left"/>
+      <w:pPr>
+        <w:ind w:left="5040" w:hanging="360"/>
+      </w:pPr>
+      <w:rPr>
+        <w:u w:val="none"/>
+      </w:rPr>
+    </w:lvl>
+    <w:lvl w:ilvl="7">
+      <w:start w:val="1"/>
+      <w:numFmt w:val="bullet"/>
+      <w:lvlText w:val="○"/>
+      <w:lvlJc w:val="left"/>
+      <w:pPr>
+        <w:ind w:left="5760" w:hanging="360"/>
+      </w:pPr>
+      <w:rPr>
+        <w:u w:val="none"/>
+      </w:rPr>
+    </w:lvl>
+    <w:lvl w:ilvl="8">
+      <w:start w:val="1"/>
+      <w:numFmt w:val="bullet"/>
+      <w:lvlText w:val="■"/>
+      <w:lvlJc w:val="left"/>
+      <w:pPr>
+        <w:ind w:left="6480" w:hanging="360"/>
+      </w:pPr>
+      <w:rPr>
+        <w:u w:val="none"/>
+      </w:rPr>
+    </w:lvl>
+  </w:abstractNum>
+  <w:abstractNum w:abstractNumId="2">
+    <w:lvl w:ilvl="0">
+      <w:start w:val="1"/>
       <w:numFmt w:val="decimal"/>
       <w:lvlText w:val="%1."/>
       <w:lvlJc w:val="left"/>
@@ -1756,7 +2878,227 @@
       </w:rPr>
     </w:lvl>
   </w:abstractNum>
-  <w:abstractNum w:abstractNumId="2">
+  <w:abstractNum w:abstractNumId="3">
+    <w:lvl w:ilvl="0">
+      <w:start w:val="1"/>
+      <w:numFmt w:val="decimal"/>
+      <w:lvlText w:val="%1."/>
+      <w:lvlJc w:val="left"/>
+      <w:pPr>
+        <w:ind w:left="720" w:hanging="360"/>
+      </w:pPr>
+      <w:rPr>
+        <w:u w:val="none"/>
+      </w:rPr>
+    </w:lvl>
+    <w:lvl w:ilvl="1">
+      <w:start w:val="1"/>
+      <w:numFmt w:val="lowerLetter"/>
+      <w:lvlText w:val="%2."/>
+      <w:lvlJc w:val="left"/>
+      <w:pPr>
+        <w:ind w:left="1440" w:hanging="360"/>
+      </w:pPr>
+      <w:rPr>
+        <w:u w:val="none"/>
+      </w:rPr>
+    </w:lvl>
+    <w:lvl w:ilvl="2">
+      <w:start w:val="1"/>
+      <w:numFmt w:val="lowerRoman"/>
+      <w:lvlText w:val="%3."/>
+      <w:lvlJc w:val="left"/>
+      <w:pPr>
+        <w:ind w:left="2160" w:hanging="360"/>
+      </w:pPr>
+      <w:rPr>
+        <w:u w:val="none"/>
+      </w:rPr>
+    </w:lvl>
+    <w:lvl w:ilvl="3">
+      <w:start w:val="1"/>
+      <w:numFmt w:val="decimal"/>
+      <w:lvlText w:val="%4."/>
+      <w:lvlJc w:val="left"/>
+      <w:pPr>
+        <w:ind w:left="2880" w:hanging="360"/>
+      </w:pPr>
+      <w:rPr>
+        <w:u w:val="none"/>
+      </w:rPr>
+    </w:lvl>
+    <w:lvl w:ilvl="4">
+      <w:start w:val="1"/>
+      <w:numFmt w:val="lowerLetter"/>
+      <w:lvlText w:val="%5."/>
+      <w:lvlJc w:val="left"/>
+      <w:pPr>
+        <w:ind w:left="3600" w:hanging="360"/>
+      </w:pPr>
+      <w:rPr>
+        <w:u w:val="none"/>
+      </w:rPr>
+    </w:lvl>
+    <w:lvl w:ilvl="5">
+      <w:start w:val="1"/>
+      <w:numFmt w:val="lowerRoman"/>
+      <w:lvlText w:val="%6."/>
+      <w:lvlJc w:val="left"/>
+      <w:pPr>
+        <w:ind w:left="4320" w:hanging="360"/>
+      </w:pPr>
+      <w:rPr>
+        <w:u w:val="none"/>
+      </w:rPr>
+    </w:lvl>
+    <w:lvl w:ilvl="6">
+      <w:start w:val="1"/>
+      <w:numFmt w:val="decimal"/>
+      <w:lvlText w:val="%7."/>
+      <w:lvlJc w:val="left"/>
+      <w:pPr>
+        <w:ind w:left="5040" w:hanging="360"/>
+      </w:pPr>
+      <w:rPr>
+        <w:u w:val="none"/>
+      </w:rPr>
+    </w:lvl>
+    <w:lvl w:ilvl="7">
+      <w:start w:val="1"/>
+      <w:numFmt w:val="lowerLetter"/>
+      <w:lvlText w:val="%8."/>
+      <w:lvlJc w:val="left"/>
+      <w:pPr>
+        <w:ind w:left="5760" w:hanging="360"/>
+      </w:pPr>
+      <w:rPr>
+        <w:u w:val="none"/>
+      </w:rPr>
+    </w:lvl>
+    <w:lvl w:ilvl="8">
+      <w:start w:val="1"/>
+      <w:numFmt w:val="lowerRoman"/>
+      <w:lvlText w:val="%9."/>
+      <w:lvlJc w:val="left"/>
+      <w:pPr>
+        <w:ind w:left="6480" w:hanging="360"/>
+      </w:pPr>
+      <w:rPr>
+        <w:u w:val="none"/>
+      </w:rPr>
+    </w:lvl>
+  </w:abstractNum>
+  <w:abstractNum w:abstractNumId="4">
+    <w:lvl w:ilvl="0">
+      <w:start w:val="1"/>
+      <w:numFmt w:val="bullet"/>
+      <w:lvlText w:val="●"/>
+      <w:lvlJc w:val="left"/>
+      <w:pPr>
+        <w:ind w:left="720" w:hanging="360"/>
+      </w:pPr>
+      <w:rPr>
+        <w:u w:val="none"/>
+      </w:rPr>
+    </w:lvl>
+    <w:lvl w:ilvl="1">
+      <w:start w:val="1"/>
+      <w:numFmt w:val="bullet"/>
+      <w:lvlText w:val="○"/>
+      <w:lvlJc w:val="left"/>
+      <w:pPr>
+        <w:ind w:left="1440" w:hanging="360"/>
+      </w:pPr>
+      <w:rPr>
+        <w:u w:val="none"/>
+      </w:rPr>
+    </w:lvl>
+    <w:lvl w:ilvl="2">
+      <w:start w:val="1"/>
+      <w:numFmt w:val="bullet"/>
+      <w:lvlText w:val="■"/>
+      <w:lvlJc w:val="left"/>
+      <w:pPr>
+        <w:ind w:left="2160" w:hanging="360"/>
+      </w:pPr>
+      <w:rPr>
+        <w:u w:val="none"/>
+      </w:rPr>
+    </w:lvl>
+    <w:lvl w:ilvl="3">
+      <w:start w:val="1"/>
+      <w:numFmt w:val="bullet"/>
+      <w:lvlText w:val="●"/>
+      <w:lvlJc w:val="left"/>
+      <w:pPr>
+        <w:ind w:left="2880" w:hanging="360"/>
+      </w:pPr>
+      <w:rPr>
+        <w:u w:val="none"/>
+      </w:rPr>
+    </w:lvl>
+    <w:lvl w:ilvl="4">
+      <w:start w:val="1"/>
+      <w:numFmt w:val="bullet"/>
+      <w:lvlText w:val="○"/>
+      <w:lvlJc w:val="left"/>
+      <w:pPr>
+        <w:ind w:left="3600" w:hanging="360"/>
+      </w:pPr>
+      <w:rPr>
+        <w:u w:val="none"/>
+      </w:rPr>
+    </w:lvl>
+    <w:lvl w:ilvl="5">
+      <w:start w:val="1"/>
+      <w:numFmt w:val="bullet"/>
+      <w:lvlText w:val="■"/>
+      <w:lvlJc w:val="left"/>
+      <w:pPr>
+        <w:ind w:left="4320" w:hanging="360"/>
+      </w:pPr>
+      <w:rPr>
+        <w:u w:val="none"/>
+      </w:rPr>
+    </w:lvl>
+    <w:lvl w:ilvl="6">
+      <w:start w:val="1"/>
+      <w:numFmt w:val="bullet"/>
+      <w:lvlText w:val="●"/>
+      <w:lvlJc w:val="left"/>
+      <w:pPr>
+        <w:ind w:left="5040" w:hanging="360"/>
+      </w:pPr>
+      <w:rPr>
+        <w:u w:val="none"/>
+      </w:rPr>
+    </w:lvl>
+    <w:lvl w:ilvl="7">
+      <w:start w:val="1"/>
+      <w:numFmt w:val="bullet"/>
+      <w:lvlText w:val="○"/>
+      <w:lvlJc w:val="left"/>
+      <w:pPr>
+        <w:ind w:left="5760" w:hanging="360"/>
+      </w:pPr>
+      <w:rPr>
+        <w:u w:val="none"/>
+      </w:rPr>
+    </w:lvl>
+    <w:lvl w:ilvl="8">
+      <w:start w:val="1"/>
+      <w:numFmt w:val="bullet"/>
+      <w:lvlText w:val="■"/>
+      <w:lvlJc w:val="left"/>
+      <w:pPr>
+        <w:ind w:left="6480" w:hanging="360"/>
+      </w:pPr>
+      <w:rPr>
+        <w:u w:val="none"/>
+      </w:rPr>
+    </w:lvl>
+  </w:abstractNum>
+  <w:abstractNum w:abstractNumId="5">
     <w:lvl w:ilvl="0">
       <w:start w:val="1"/>
       <w:numFmt w:val="decimal"/>
@@ -1871,6 +3213,15 @@
   </w:num>
   <w:num w:numId="2">
     <w:abstractNumId w:val="2"/>
+  </w:num>
+  <w:num w:numId="3">
+    <w:abstractNumId w:val="3"/>
+  </w:num>
+  <w:num w:numId="4">
+    <w:abstractNumId w:val="4"/>
+  </w:num>
+  <w:num w:numId="5">
+    <w:abstractNumId w:val="5"/>
   </w:num>
 </w:numbering>
 </file>

</xml_diff>